<commit_message>
FOVI 2026: firmantes UJPA y UNILAB verificados en cartas firmadas de INTEEGRA; telefono del IR
Co-Authored-By: Claude Sonnet 5.5 <noreply@anthropic.com>
Claude-Session: https://claude.ai/code/session_01P4g3Yf3jcPuX77QSmk15pC
</commit_message>
<xml_diff>
--- a/fovi2026/FOVI2026_Formulario_INTEEGRA_v0.4.docx
+++ b/fovi2026/FOVI2026_Formulario_INTEEGRA_v0.4.docx
@@ -4505,9 +4505,8 @@
                 <w:rFonts w:ascii="Verdana" w:hAnsi="Verdana" w:cs="Verdana" w:eastAsia="Verdana"/>
                 <w:b w:val="0"/>
                 <w:sz w:val="20"/>
-                <w:highlight w:val="yellow"/>
-              </w:rPr>
-              <w:t>[COMPLETAR]</w:t>
+              </w:rPr>
+              <w:t>+56 9 4783 3697</w:t>
             </w:r>
           </w:p>
         </w:tc>

</xml_diff>

<commit_message>
FOVI 2026: Universidade Politécnica de Coimbra en formulario v0.4 y presupuesto
Co-Authored-By: Claude Sonnet 5.5 <noreply@anthropic.com>
Claude-Session: https://claude.ai/code/session_01P4g3Yf3jcPuX77QSmk15pC
</commit_message>
<xml_diff>
--- a/fovi2026/FOVI2026_Formulario_INTEEGRA_v0.4.docx
+++ b/fovi2026/FOVI2026_Formulario_INTEEGRA_v0.4.docx
@@ -3485,7 +3485,7 @@
                 <w:b w:val="0"/>
                 <w:sz w:val="20"/>
               </w:rPr>
-              <w:t>Instituto Politécnico de Coimbra</w:t>
+              <w:t>Universidade Politécnica de Coimbra</w:t>
             </w:r>
           </w:p>
         </w:tc>
@@ -7790,7 +7790,7 @@
                 <w:b w:val="0"/>
                 <w:sz w:val="20"/>
               </w:rPr>
-              <w:t>Instituto Politécnico de Coimbra (ISEC), Portugal</w:t>
+              <w:t>Universidade Politécnica de Coimbra (ISEC), Portugal</w:t>
             </w:r>
           </w:p>
         </w:tc>
@@ -9076,7 +9076,7 @@
                 <w:b w:val="0"/>
                 <w:sz w:val="20"/>
               </w:rPr>
-              <w:t>Esta propuesta consolida una red entre la Universidad de Santiago de Chile (Región Metropolitana), instituciones nacionales de otras regiones y cuatro instituciones extranjeras: Universidade Jean Piaget de Angola, Politécnico de Coimbra (Portugal), Universidade Estadual do Paraná y Universidade da Integração Internacional da Lusofonia Afro-Brasileira (Brasil). Parte de un trabajo conjunto previo: en 2026 diseñaron la propuesta INTEEGRA-Saúde.</w:t>
+              <w:t>Esta propuesta consolida una red entre la Universidad de Santiago de Chile (Región Metropolitana), instituciones nacionales de otras regiones y cuatro instituciones extranjeras: Universidade Jean Piaget de Angola, Universidade Politécnica de Coimbra (Portugal), Universidade Estadual do Paraná y Universidade da Integração Internacional da Lusofonia Afro-Brasileira (Brasil). Parte de un trabajo conjunto previo: en 2026 diseñaron la propuesta INTEEGRA-Saúde.</w:t>
             </w:r>
           </w:p>
           <w:p>
@@ -10783,25 +10783,25 @@
                 <w:b w:val="0"/>
                 <w:sz w:val="20"/>
               </w:rPr>
-              <w:t>USACH y la Universidade Jean Piaget de Angola (UJPA) tienen un convenio marco vigente de cooperación. La UJPA, junto con el ISPTEC y el ISTM de Angola, expresó por escrito en mayo de 2026 su compromiso de colaborar con USACH. Entre abril y junio de 2026, USACH, la UJPA y el Instituto Politécnico de Coimbra (IPC) diseñaron conjuntamente la propuesta INTEEGRA-Saúde: reuniones de trabajo (11 y 18 de mayo), versiones sucesivas del documento, y cartas de compromiso firmadas por el Rector (S) de USACH, el Reitor de la UJPA y la Vicepresidente del IPC. La propuesta se presentó el 1 de junio de 2026 a la II Convocatoria del Fondo de Cooperación Triangular Portugal–América Latina–África (SEGIB y Camões) y no fue adjudicada en agosto. Las instituciones han declarado por escrito su interés en continuar. Esta propuesta aprovecha ese trabajo: el diagnóstico, la teoría del cambio, los indicadores y la matriz de riesgos ya existen y se adaptan a la escala de este concurso.</w:t>
-            </w:r>
-          </w:p>
-          <w:p>
-            <w:pPr>
-              <w:spacing w:line="240" w:lineRule="auto" w:after="60"/>
-            </w:pPr>
-          </w:p>
-          <w:p>
-            <w:pPr>
-              <w:spacing w:line="240" w:lineRule="auto" w:after="60"/>
-            </w:pPr>
-            <w:r>
-              <w:rPr>
-                <w:rFonts w:ascii="Verdana" w:hAnsi="Verdana" w:cs="Verdana" w:eastAsia="Verdana"/>
-                <w:b w:val="0"/>
-                <w:sz w:val="20"/>
-              </w:rPr>
-              <w:t>El IPC es además socio de la UJPA. Su núcleo SUScita, vinculado a la geografía de la salud y la sustentabilidad, conecta al IPC con la Universidade Estadual do Paraná (UNESPAR), cuyo equipo de geografía y ordenamiento territorial participa como socio invitado desde 2026 y firmó una carta de apoyo institucional el 27 de mayo de 2026.</w:t>
+              <w:t>USACH y la Universidade Jean Piaget de Angola (UJPA) tienen un convenio marco vigente de cooperación. La UJPA, junto con el ISPTEC y el ISTM de Angola, expresó por escrito en mayo de 2026 su compromiso de colaborar con USACH. Entre abril y junio de 2026, USACH, la UJPA y la Universidade Politécnica de Coimbra (UPCoimbra, antes Instituto Politécnico de Coimbra) diseñaron conjuntamente la propuesta INTEEGRA-Saúde: reuniones de trabajo (11 y 18 de mayo), versiones sucesivas del documento, y cartas de compromiso firmadas por el Rector (S) de USACH, el Reitor de la UJPA y la Vice-Reitora de la UPCoimbra. La propuesta se presentó el 1 de junio de 2026 a la II Convocatoria del Fondo de Cooperación Triangular Portugal–América Latina–África (SEGIB y Camões) y no fue adjudicada en agosto. Las instituciones han declarado por escrito su interés en continuar. Esta propuesta aprovecha ese trabajo: el diagnóstico, la teoría del cambio, los indicadores y la matriz de riesgos ya existen y se adaptan a la escala de este concurso.</w:t>
+            </w:r>
+          </w:p>
+          <w:p>
+            <w:pPr>
+              <w:spacing w:line="240" w:lineRule="auto" w:after="60"/>
+            </w:pPr>
+          </w:p>
+          <w:p>
+            <w:pPr>
+              <w:spacing w:line="240" w:lineRule="auto" w:after="60"/>
+            </w:pPr>
+            <w:r>
+              <w:rPr>
+                <w:rFonts w:ascii="Verdana" w:hAnsi="Verdana" w:cs="Verdana" w:eastAsia="Verdana"/>
+                <w:b w:val="0"/>
+                <w:sz w:val="20"/>
+              </w:rPr>
+              <w:t>La UPCoimbra es además socia de la UJPA. Su núcleo SUScita, vinculado a la geografía de la salud y la sustentabilidad, conecta a la UPCoimbra con la Universidade Estadual do Paraná (UNESPAR), cuyo equipo de geografía y ordenamiento territorial participa como socio invitado desde 2026 y firmó una carta de apoyo institucional el 27 de mayo de 2026.</w:t>
             </w:r>
           </w:p>
           <w:p>
@@ -11716,7 +11716,7 @@
                 <w:b w:val="0"/>
                 <w:sz w:val="20"/>
               </w:rPr>
-              <w:t>Instituto Politécnico de Coimbra (Portugal). Creado en 1979, es una de las diez mayores instituciones de educación superior públicas de Portugal, con seis unidades de enseñanza y una unidad de investigación (i2A, Instituto de Investigação Aplicada). Su Instituto Superior de Engenharia (ISEC) y el núcleo SUScita aportan ingeniería aplicada, análisis geoespacial y trayectoria en cooperación técnica con los países africanos de lengua portuguesa. El investigador João Paulo Martins Gouveia coordinó la participación del IPC en INTEEGRA-Saúde. Aporta a Chile capacidad en SIG y geografía de la salud (la base teórica de Santana, 2014, es de la Universidad de Coimbra), útil para el estudio comparado y para formar a estudiantes y tesistas chilenos. Complementa a USACH en el análisis territorial y a la UCM en la lectura de determinantes sociales.</w:t>
+              <w:t>Universidade Politécnica de Coimbra (Portugal). Creada en 1979 como Instituto Politécnico de Coimbra, es una de las diez mayores instituciones de educación superior públicas de Portugal, con seis unidades de enseñanza y una unidad de investigación (i2A, Instituto de Investigação Aplicada). Su Instituto Superior de Engenharia (ISEC) y el núcleo SUScita aportan ingeniería aplicada, análisis geoespacial y trayectoria en cooperación técnica con los países africanos de lengua portuguesa. El investigador João Paulo Martins Gouveia coordinó la participación de la UPCoimbra en INTEEGRA-Saúde. Aporta a Chile capacidad en SIG y geografía de la salud (la base teórica de Santana, 2014, es de la Universidad de Coimbra), útil para el estudio comparado y para formar a estudiantes y tesistas chilenos. Complementa a USACH en el análisis territorial y a la UCM en la lectura de determinantes sociales.</w:t>
             </w:r>
           </w:p>
           <w:p>
@@ -11761,7 +11761,7 @@
                 <w:b w:val="0"/>
                 <w:sz w:val="20"/>
               </w:rPr>
-              <w:t>Universidade Estadual do Paraná (Brasil). La Dra. Áurea Andrade Viana, del Campus de Campo Mourão, aporta experiencia en geografía, gobernanza territorial y análisis de datos. Está vinculada al IPC a través de SUScita y participa en los módulos de formación y en el análisis territorial. Contribuye a la red con una mirada sudamericana de territorios rurales y de ciudades intermedias, cercana a las regiones asociadas.</w:t>
+              <w:t>Universidade Estadual do Paraná (Brasil). La Dra. Áurea Andrade Viana, del Campus de Campo Mourão, aporta experiencia en geografía, gobernanza territorial y análisis de datos. Está vinculada a la UPCoimbra a través de SUScita y participa en los módulos de formación y en el análisis territorial. Contribuye a la red con una mirada sudamericana de territorios rurales y de ciudades intermedias, cercana a las regiones asociadas.</w:t>
             </w:r>
           </w:p>
           <w:p>
@@ -12015,7 +12015,7 @@
                 <w:b w:val="0"/>
                 <w:sz w:val="20"/>
               </w:rPr>
-              <w:t>Quiénes y dónde. Dos pasantías de integrantes del grupo chileno (miembros de USACH y de las instituciones nacionales asociadas): (1) Coimbra, Portugal, dos personas, 7 días, en el ISEC-IPC. (2) Luanda, Angola, dos personas, 8 días, en la Universidade Jean Piaget.</w:t>
+              <w:t>Quiénes y dónde. Dos pasantías de integrantes del grupo chileno (miembros de USACH y de las instituciones nacionales asociadas): (1) Coimbra, Portugal, dos personas, 7 días, en el ISEC (UPCoimbra). (2) Luanda, Angola, dos personas, 8 días, en la Universidade Jean Piaget.</w:t>
             </w:r>
           </w:p>
           <w:p>
@@ -12029,7 +12029,7 @@
                 <w:b w:val="0"/>
                 <w:sz w:val="20"/>
               </w:rPr>
-              <w:t>Objetivos y actividades. En Coimbra (primero): trabajo con el equipo del IPC para definir el protocolo de estudio común y estandarizar el análisis geoespacial (SIG) y los indicadores de accesibilidad, clima y sustentabilidad de los centros. En Luanda (después): aplicación del protocolo en terreno con la UJPA, observación de unidades de APS (accesibilidad, residuos, energía y agua) y levantamiento de datos de contexto.</w:t>
+              <w:t>Objetivos y actividades. En Coimbra (primero): trabajo con el equipo de la UPCoimbra para definir el protocolo de estudio común y estandarizar el análisis geoespacial (SIG) y los indicadores de accesibilidad, clima y sustentabilidad de los centros. En Luanda (después): aplicación del protocolo en terreno con la UJPA, observación de unidades de APS (accesibilidad, residuos, energía y agua) y levantamiento de datos de contexto.</w:t>
             </w:r>
             <w:commentRangeEnd w:id="9"/>
             <w:r>
@@ -12291,7 +12291,7 @@
                 <w:b w:val="0"/>
                 <w:sz w:val="20"/>
               </w:rPr>
-              <w:t>Actividades. (1) Visita de dos investigadores extranjeros (un/a investigador/a del IPC y uno/a de la UJPA) para dar ponencias y un taller en Santiago y en una región asociada, hasta 10 días. (2) Tres seminarios virtuales bilingües español–portugués, orientados por los resultados del estudio comparado, con transmisión en vivo e interpretación simultánea: APS y territorio; determinantes sociales y cambio climático; presentación de resultados. (3) Un taller presencial en Santiago y una jornada territorial en una región asociada, con las instituciones nacionales asociadas.</w:t>
+              <w:t>Actividades. (1) Visita de dos investigadores extranjeros (un/a investigador/a de la UPCoimbra y uno/a de la UJPA) para dar ponencias y un taller en Santiago y en una región asociada, hasta 10 días. (2) Tres seminarios virtuales bilingües español–portugués, orientados por los resultados del estudio comparado, con transmisión en vivo e interpretación simultánea: APS y territorio; determinantes sociales y cambio climático; presentación de resultados. (3) Un taller presencial en Santiago y una jornada territorial en una región asociada, con las instituciones nacionales asociadas.</w:t>
             </w:r>
             <w:commentRangeEnd w:id="10"/>
             <w:r>

</xml_diff>